<commit_message>
Align docs with the sprint review
</commit_message>
<xml_diff>
--- a/docs/MoviePlatform-Service-Reference.docx
+++ b/docs/MoviePlatform-Service-Reference.docx
@@ -1928,7 +1928,7 @@
         <w:t xml:space="preserve">Claims:</w:t>
       </w:r>
       <w:r>
-        <w:t xml:space="preserve"> the token carries the user's UUID (sub), role and name, so each service knows who is calling and whether they are an admin. It is valid for 2 hours.</w:t>
+        <w:t xml:space="preserve"> the token carries the user's UUID (sub), role and name, so each service knows who is calling and whether they are an admin. It is valid for 30 minutes.</w:t>
       </w:r>
     </w:p>
     <w:p>
@@ -2096,7 +2096,7 @@
         <w:t xml:space="preserve">Envelope:</w:t>
       </w:r>
       <w:r>
-        <w:t xml:space="preserve"> {event, id (uuid), occurred_at, correlation_id, data}. Handlers are idempotent: event ids already handled are recorded in a processed_events table and skipped. The exact payload of every event is in docs/events.md.</w:t>
+        <w:t xml:space="preserve"> {event, id (uuid), occurred_at, data}. Handlers are idempotent: event ids already handled are recorded in a processed_events table and skipped. The exact payload of every event is in docs/events.md.</w:t>
       </w:r>
     </w:p>
     <w:p>
@@ -2626,7 +2626,7 @@
                 <w:sz w:val="19"/>
                 <w:szCs w:val="19"/>
               </w:rPr>
-              <w:t xml:space="preserve">Engagement, Social, Notification</w:t>
+              <w:t xml:space="preserve">Engagement, Social (blocked and deleted); Intelligence, Notification (deleted only)</w:t>
             </w:r>
           </w:p>
         </w:tc>
@@ -2786,136 +2786,6 @@
                 <w:szCs w:val="19"/>
               </w:rPr>
               <w:t xml:space="preserve">Show that user's reviews and activity again</w:t>
-            </w:r>
-          </w:p>
-        </w:tc>
-      </w:tr>
-      <w:tr>
-        <w:tc>
-          <w:tcPr>
-            <w:tcW w:type="dxa" w:w="2200"/>
-            <w:tcBorders>
-              <w:top w:val="single" w:color="000000" w:sz="4"/>
-              <w:left w:val="single" w:color="000000" w:sz="4"/>
-              <w:bottom w:val="single" w:color="000000" w:sz="4"/>
-              <w:right w:val="single" w:color="000000" w:sz="4"/>
-            </w:tcBorders>
-            <w:tcMar>
-              <w:top w:type="dxa" w:w="60"/>
-              <w:left w:type="dxa" w:w="100"/>
-              <w:bottom w:type="dxa" w:w="60"/>
-              <w:right w:type="dxa" w:w="100"/>
-            </w:tcMar>
-          </w:tcPr>
-          <w:p>
-            <w:r>
-              <w:rPr>
-                <w:rFonts w:ascii="Arial" w:cs="Arial" w:eastAsia="Arial" w:hAnsi="Arial"/>
-                <w:b w:val="false"/>
-                <w:bCs w:val="false"/>
-                <w:sz w:val="19"/>
-                <w:szCs w:val="19"/>
-              </w:rPr>
-              <w:t xml:space="preserve">MovieUpdated</w:t>
-            </w:r>
-          </w:p>
-          <w:p>
-            <w:r>
-              <w:rPr>
-                <w:rFonts w:ascii="Arial" w:cs="Arial" w:eastAsia="Arial" w:hAnsi="Arial"/>
-                <w:b w:val="false"/>
-                <w:bCs w:val="false"/>
-                <w:sz w:val="19"/>
-                <w:szCs w:val="19"/>
-              </w:rPr>
-              <w:t xml:space="preserve">movie.updated</w:t>
-            </w:r>
-          </w:p>
-        </w:tc>
-        <w:tc>
-          <w:tcPr>
-            <w:tcW w:type="dxa" w:w="1500"/>
-            <w:tcBorders>
-              <w:top w:val="single" w:color="000000" w:sz="4"/>
-              <w:left w:val="single" w:color="000000" w:sz="4"/>
-              <w:bottom w:val="single" w:color="000000" w:sz="4"/>
-              <w:right w:val="single" w:color="000000" w:sz="4"/>
-            </w:tcBorders>
-            <w:tcMar>
-              <w:top w:type="dxa" w:w="60"/>
-              <w:left w:type="dxa" w:w="100"/>
-              <w:bottom w:type="dxa" w:w="60"/>
-              <w:right w:type="dxa" w:w="100"/>
-            </w:tcMar>
-          </w:tcPr>
-          <w:p>
-            <w:r>
-              <w:rPr>
-                <w:rFonts w:ascii="Arial" w:cs="Arial" w:eastAsia="Arial" w:hAnsi="Arial"/>
-                <w:b w:val="false"/>
-                <w:bCs w:val="false"/>
-                <w:sz w:val="19"/>
-                <w:szCs w:val="19"/>
-              </w:rPr>
-              <w:t xml:space="preserve">Catalog</w:t>
-            </w:r>
-          </w:p>
-        </w:tc>
-        <w:tc>
-          <w:tcPr>
-            <w:tcW w:type="dxa" w:w="2100"/>
-            <w:tcBorders>
-              <w:top w:val="single" w:color="000000" w:sz="4"/>
-              <w:left w:val="single" w:color="000000" w:sz="4"/>
-              <w:bottom w:val="single" w:color="000000" w:sz="4"/>
-              <w:right w:val="single" w:color="000000" w:sz="4"/>
-            </w:tcBorders>
-            <w:tcMar>
-              <w:top w:type="dxa" w:w="60"/>
-              <w:left w:type="dxa" w:w="100"/>
-              <w:bottom w:type="dxa" w:w="60"/>
-              <w:right w:type="dxa" w:w="100"/>
-            </w:tcMar>
-          </w:tcPr>
-          <w:p>
-            <w:r>
-              <w:rPr>
-                <w:rFonts w:ascii="Arial" w:cs="Arial" w:eastAsia="Arial" w:hAnsi="Arial"/>
-                <w:b w:val="false"/>
-                <w:bCs w:val="false"/>
-                <w:sz w:val="19"/>
-                <w:szCs w:val="19"/>
-              </w:rPr>
-              <w:t xml:space="preserve">Intelligence</w:t>
-            </w:r>
-          </w:p>
-        </w:tc>
-        <w:tc>
-          <w:tcPr>
-            <w:tcW w:type="dxa" w:w="3226"/>
-            <w:tcBorders>
-              <w:top w:val="single" w:color="000000" w:sz="4"/>
-              <w:left w:val="single" w:color="000000" w:sz="4"/>
-              <w:bottom w:val="single" w:color="000000" w:sz="4"/>
-              <w:right w:val="single" w:color="000000" w:sz="4"/>
-            </w:tcBorders>
-            <w:tcMar>
-              <w:top w:type="dxa" w:w="60"/>
-              <w:left w:type="dxa" w:w="100"/>
-              <w:bottom w:type="dxa" w:w="60"/>
-              <w:right w:type="dxa" w:w="100"/>
-            </w:tcMar>
-          </w:tcPr>
-          <w:p>
-            <w:r>
-              <w:rPr>
-                <w:rFonts w:ascii="Arial" w:cs="Arial" w:eastAsia="Arial" w:hAnsi="Arial"/>
-                <w:b w:val="false"/>
-                <w:bCs w:val="false"/>
-                <w:sz w:val="19"/>
-                <w:szCs w:val="19"/>
-              </w:rPr>
-              <w:t xml:space="preserve">Refresh cached movie features</w:t>
             </w:r>
           </w:p>
         </w:tc>
@@ -4352,26 +4222,6 @@
       </w:r>
       <w:r>
         <w:t xml:space="preserve"> every service documents its endpoints in docs/api/&lt;service&gt;.md, following the common rules in docs/api/conventions.md.</w:t>
-      </w:r>
-    </w:p>
-    <w:p>
-      <w:pPr>
-        <w:pStyle w:val="ListParagraph"/>
-        <w:numPr>
-          <w:ilvl w:val="0"/>
-          <w:numId w:val="2"/>
-        </w:numPr>
-        <w:spacing w:after="60"/>
-      </w:pPr>
-      <w:r>
-        <w:rPr>
-          <w:b/>
-          <w:bCs/>
-        </w:rPr>
-        <w:t xml:space="preserve">Correlation ID:</w:t>
-      </w:r>
-      <w:r>
-        <w:t xml:space="preserve"> the Gateway adds an X-Correlation-ID header so one request can be traced across logs.</w:t>
       </w:r>
     </w:p>
     <w:p>
@@ -4723,7 +4573,7 @@
         <w:t xml:space="preserve">Middleware:</w:t>
       </w:r>
       <w:r>
-        <w:t xml:space="preserve"> EnsureAuthenticated (JWT in session), EnsureAdmin, AddCorrelationId.</w:t>
+        <w:t xml:space="preserve"> EnsureAuthenticated (JWT in session), EnsureAdmin.</w:t>
       </w:r>
     </w:p>
     <w:p>
@@ -6061,7 +5911,7 @@
                 <w:sz w:val="19"/>
                 <w:szCs w:val="19"/>
               </w:rPr>
-              <w:t xml:space="preserve">Exchange a still-valid token for a new one (2 hours)</w:t>
+              <w:t xml:space="preserve">Exchange a still-valid token for a new one (30 minutes)</w:t>
             </w:r>
           </w:p>
         </w:tc>
@@ -6121,7 +5971,7 @@
                 <w:sz w:val="19"/>
                 <w:szCs w:val="19"/>
               </w:rPr>
-              <w:t xml:space="preserve">Log out (the Gateway deletes the token from its session; tokens expire after 2 hours)</w:t>
+              <w:t xml:space="preserve">Log out (the Gateway deletes the token from its session; tokens expire after 30 minutes)</w:t>
             </w:r>
           </w:p>
         </w:tc>
@@ -8571,7 +8421,7 @@
                 <w:sz w:val="19"/>
                 <w:szCs w:val="19"/>
               </w:rPr>
-              <w:t xml:space="preserve">MovieUpdated, MovieDeleted</w:t>
+              <w:t xml:space="preserve">MovieDeleted</w:t>
             </w:r>
           </w:p>
         </w:tc>
@@ -14597,7 +14447,7 @@
                 <w:sz w:val="19"/>
                 <w:szCs w:val="19"/>
               </w:rPr>
-              <w:t xml:space="preserve">ReviewCreated, ReviewUpdated (sentiment); RatingAdded, MovieWatched, UserGenresUpdated, MovieUpdated, MovieDeleted (taste profiles, recommendations)</w:t>
+              <w:t xml:space="preserve">ReviewCreated, ReviewUpdated (sentiment); RatingAdded, MovieWatched, UserGenresUpdated, UserDeleted, MovieDeleted (taste profiles, recommendations)</w:t>
             </w:r>
           </w:p>
         </w:tc>
@@ -15717,7 +15567,7 @@
                 <w:sz w:val="19"/>
                 <w:szCs w:val="19"/>
               </w:rPr>
-              <w:t xml:space="preserve">UserRegistered, UserFollowed, MovieNightInviteSent, MovieNightInviteAnswered, MovieNightFinalized, UserBlocked, UserDeleted</w:t>
+              <w:t xml:space="preserve">UserRegistered, UserFollowed, MovieNightInviteSent, MovieNightInviteAnswered, MovieNightFinalized, UserDeleted</w:t>
             </w:r>
           </w:p>
         </w:tc>
@@ -17706,7 +17556,7 @@
           <w:sz w:val="17"/>
           <w:szCs w:val="17"/>
         </w:rPr>
-        <w:t xml:space="preserve">routes/api.php → Middleware (JWT, correlation id) → Request rules ($this-&gt;validate) → Controller → Policy (authorize) → Service (logic) → Model (database) → EventPublisher (after commit) → Resource (JSON response)</w:t>
+        <w:t xml:space="preserve">routes/api.php → Middleware (JWT) → Request rules ($this-&gt;validate) → Controller → Policy (authorize) → Service (logic) → Model (database) → EventPublisher (after commit) → Resource (JSON response)</w:t>
       </w:r>
     </w:p>
     <w:tbl>
@@ -18861,7 +18711,7 @@
                 <w:sz w:val="16"/>
                 <w:szCs w:val="16"/>
               </w:rPr>
-              <w:t xml:space="preserve">│   ├── Http/Middleware/        AuthenticateJwt, EnsureAdmin, AddCorrelationId</w:t>
+              <w:t xml:space="preserve">│   ├── Http/Middleware/        AuthenticateJwt, EnsureAdmin</w:t>
             </w:r>
           </w:p>
           <w:p>
@@ -22494,7 +22344,7 @@
         <w:spacing w:after="60"/>
       </w:pPr>
       <w:r>
-        <w:t xml:space="preserve">Before the token expires (2 hours), the Gateway exchanges it for a new one (POST /api/token/refresh). Logging out deletes the token from the session.</w:t>
+        <w:t xml:space="preserve">Before the token expires (30 minutes), the Gateway exchanges it for a new one (POST /api/token/refresh). Logging out deletes the token from the session.</w:t>
       </w:r>
     </w:p>
     <w:p>

</xml_diff>